<commit_message>
chore (rapport) : Avancement sur le rapport
</commit_message>
<xml_diff>
--- a/doc/R-320-P_OO-KirilBormin.docx
+++ b/doc/R-320-P_OO-KirilBormin.docx
@@ -3932,10 +3932,7 @@
         <w:pStyle w:val="Retraitcorpsdetexte"/>
       </w:pPr>
       <w:r>
-        <w:t xml:space="preserve">Mais </w:t>
-      </w:r>
-      <w:r>
-        <w:t>cependant</w:t>
+        <w:t>Cependant</w:t>
       </w:r>
       <w:r>
         <w:t xml:space="preserve"> on peut perdre, si on a été touché par l’avion de l’ennemie, ou nous avons s’écraser contre la tour(l’obstacle).</w:t>
@@ -4045,7 +4042,51 @@
     <w:p>
       <w:pPr>
         <w:pStyle w:val="Retraitcorpsdetexte"/>
-      </w:pPr>
+        <w:numPr>
+          <w:ilvl w:val="0"/>
+          <w:numId w:val="53"/>
+        </w:numPr>
+        <w:ind w:left="360"/>
+      </w:pPr>
+      <w:proofErr w:type="spellStart"/>
+      <w:r>
+        <w:t>AirSpace</w:t>
+      </w:r>
+      <w:proofErr w:type="spellEnd"/>
+      <w:r>
+        <w:t xml:space="preserve"> : C'est la classe la plus importante</w:t>
+      </w:r>
+      <w:r>
+        <w:t>, i</w:t>
+      </w:r>
+      <w:r>
+        <w:t xml:space="preserve">l hérite de </w:t>
+      </w:r>
+      <w:proofErr w:type="spellStart"/>
+      <w:r>
+        <w:t>Form</w:t>
+      </w:r>
+      <w:proofErr w:type="spellEnd"/>
+      <w:r>
+        <w:t xml:space="preserve">. </w:t>
+      </w:r>
+      <w:r>
+        <w:t>C'est lui qui</w:t>
+      </w:r>
+      <w:r>
+        <w:t xml:space="preserve"> </w:t>
+      </w:r>
+      <w:r>
+        <w:t xml:space="preserve">tourne en boucle et qui gère la logique principale, comme </w:t>
+      </w:r>
+      <w:proofErr w:type="spellStart"/>
+      <w:r>
+        <w:t>Render</w:t>
+      </w:r>
+      <w:proofErr w:type="spellEnd"/>
+      <w:r>
+        <w:t xml:space="preserve"> et Update de tous les objets.</w:t>
+      </w:r>
     </w:p>
     <w:p>
       <w:pPr>
@@ -4062,48 +4103,46 @@
       </w:r>
       <w:proofErr w:type="spellEnd"/>
       <w:r>
-        <w:t xml:space="preserve"> : C'est la classe la plus importante, </w:t>
-      </w:r>
-      <w:r>
-        <w:t>(</w:t>
-      </w:r>
-      <w:r>
-        <w:t>un peu comme le cerveau du jeu</w:t>
-      </w:r>
-      <w:r>
-        <w:t>)</w:t>
-      </w:r>
-      <w:r>
-        <w:t xml:space="preserve">. Il hérite de </w:t>
+        <w:t xml:space="preserve"> a des listes pour garder le Player, les </w:t>
       </w:r>
       <w:proofErr w:type="spellStart"/>
       <w:r>
-        <w:t>Form</w:t>
+        <w:t>Enemy</w:t>
       </w:r>
       <w:proofErr w:type="spellEnd"/>
       <w:r>
-        <w:t xml:space="preserve"> (la flèche triangle ). C'est lui qui</w:t>
-      </w:r>
-      <w:r>
-        <w:t xml:space="preserve"> </w:t>
-      </w:r>
-      <w:r>
-        <w:t xml:space="preserve">tourne en boucle et qui gère la logique principale, comme </w:t>
-      </w:r>
-      <w:proofErr w:type="spellStart"/>
-      <w:r>
-        <w:t>Render</w:t>
-      </w:r>
-      <w:proofErr w:type="spellEnd"/>
-      <w:r>
-        <w:t xml:space="preserve"> et Update de tous les objets.</w:t>
-      </w:r>
-    </w:p>
-    <w:p>
-      <w:pPr>
-        <w:pStyle w:val="Retraitcorpsdetexte"/>
-        <w:ind w:left="774"/>
-      </w:pPr>
+        <w:t xml:space="preserve">, les Missile et les Obstacle. Sur le diagramme, </w:t>
+      </w:r>
+      <w:r>
+        <w:t>ce sont</w:t>
+      </w:r>
+      <w:r>
+        <w:t xml:space="preserve"> l</w:t>
+      </w:r>
+      <w:r>
+        <w:t>es</w:t>
+      </w:r>
+      <w:r>
+        <w:t xml:space="preserve"> ligne</w:t>
+      </w:r>
+      <w:r>
+        <w:t>s</w:t>
+      </w:r>
+      <w:r>
+        <w:t xml:space="preserve"> avec </w:t>
+      </w:r>
+      <w:r>
+        <w:t>des</w:t>
+      </w:r>
+      <w:r>
+        <w:t xml:space="preserve"> losange</w:t>
+      </w:r>
+      <w:r>
+        <w:t>s</w:t>
+      </w:r>
+      <w:r>
+        <w:t xml:space="preserve">. </w:t>
+      </w:r>
     </w:p>
     <w:p>
       <w:pPr>
@@ -4115,38 +4154,50 @@
         <w:ind w:left="360"/>
       </w:pPr>
       <w:r>
-        <w:t xml:space="preserve">Relation d'Agrégation : </w:t>
+        <w:t xml:space="preserve">Player, </w:t>
       </w:r>
       <w:proofErr w:type="spellStart"/>
       <w:r>
-        <w:t>AirSpace</w:t>
+        <w:t>Enemy</w:t>
       </w:r>
       <w:proofErr w:type="spellEnd"/>
       <w:r>
-        <w:t xml:space="preserve"> a des listes pour garder le Player, les </w:t>
+        <w:t>, Missile, Obstacle : Ce sont les modèles pour les objets du jeu. Chaque classe a ses propres attributs comme _</w:t>
       </w:r>
       <w:proofErr w:type="spellStart"/>
       <w:r>
-        <w:t>Enemy</w:t>
+        <w:t>hp</w:t>
       </w:r>
       <w:proofErr w:type="spellEnd"/>
       <w:r>
-        <w:t xml:space="preserve">, les Missile et les Obstacle. Sur le diagramme, c'est la ligne avec le losange. Ça veut dire que </w:t>
+        <w:t>, _x, _y,</w:t>
+      </w:r>
+      <w:r>
+        <w:t xml:space="preserve"> _move, etc.</w:t>
+      </w:r>
+      <w:r>
+        <w:t xml:space="preserve"> </w:t>
+      </w:r>
+      <w:r>
+        <w:t>E</w:t>
+      </w:r>
+      <w:r>
+        <w:t xml:space="preserve">t </w:t>
+      </w:r>
+      <w:r>
+        <w:t>leurs</w:t>
+      </w:r>
+      <w:r>
+        <w:t xml:space="preserve"> méthodes Update, </w:t>
       </w:r>
       <w:proofErr w:type="spellStart"/>
       <w:r>
-        <w:t>Airspace</w:t>
+        <w:t>Render</w:t>
       </w:r>
       <w:proofErr w:type="spellEnd"/>
       <w:r>
-        <w:t xml:space="preserve"> utilise ces objets. </w:t>
-      </w:r>
-    </w:p>
-    <w:p>
-      <w:pPr>
-        <w:pStyle w:val="Retraitcorpsdetexte"/>
-        <w:ind w:left="0"/>
-      </w:pPr>
+        <w:t>.</w:t>
+      </w:r>
     </w:p>
     <w:p>
       <w:pPr>
@@ -4158,46 +4209,22 @@
         <w:ind w:left="360"/>
       </w:pPr>
       <w:r>
-        <w:t xml:space="preserve">Player, </w:t>
+        <w:t>Program : Cette classe commence tout</w:t>
+      </w:r>
+      <w:r>
+        <w:t xml:space="preserve">, il appelle la classe </w:t>
       </w:r>
       <w:proofErr w:type="spellStart"/>
       <w:r>
-        <w:t>Enemy</w:t>
+        <w:t>AirSpace</w:t>
       </w:r>
       <w:proofErr w:type="spellEnd"/>
       <w:r>
-        <w:t>, Missile, Obstacle : Ce sont les modèles pour les objets du jeu. Chaque classe a ses propres attributs comme _</w:t>
-      </w:r>
-      <w:proofErr w:type="spellStart"/>
-      <w:r>
-        <w:t>hp</w:t>
-      </w:r>
-      <w:proofErr w:type="spellEnd"/>
-      <w:r>
-        <w:t xml:space="preserve">, _x, _y, et ses méthodes Update, </w:t>
-      </w:r>
-      <w:proofErr w:type="spellStart"/>
-      <w:r>
-        <w:t>Render</w:t>
-      </w:r>
-      <w:proofErr w:type="spellEnd"/>
-      <w:r>
-        <w:t xml:space="preserve">. Update() de Missile le fait bouger en haut , mais Update() de </w:t>
-      </w:r>
-      <w:proofErr w:type="spellStart"/>
-      <w:r>
-        <w:t>Enemy</w:t>
-      </w:r>
-      <w:proofErr w:type="spellEnd"/>
-      <w:r>
-        <w:t xml:space="preserve"> le fait bouger en bas.</w:t>
-      </w:r>
-    </w:p>
-    <w:p>
-      <w:pPr>
-        <w:pStyle w:val="Retraitcorpsdetexte"/>
-        <w:ind w:left="0"/>
-      </w:pPr>
+        <w:t>, en lui donnant des paramètres pour les objets du jeu</w:t>
+      </w:r>
+      <w:r>
+        <w:t>.</w:t>
+      </w:r>
     </w:p>
     <w:p>
       <w:pPr>
@@ -4208,88 +4235,55 @@
         </w:numPr>
         <w:ind w:left="360"/>
       </w:pPr>
-      <w:r>
-        <w:t xml:space="preserve">Program : Cette classe commence tout. Sa méthode Main() crée la fenêtre </w:t>
-      </w:r>
       <w:proofErr w:type="spellStart"/>
       <w:r>
-        <w:t>Airspace</w:t>
+        <w:t>GlobalHelpers</w:t>
       </w:r>
       <w:proofErr w:type="spellEnd"/>
       <w:r>
-        <w:t xml:space="preserve"> et les premiers objets pour lancer le jeu .</w:t>
+        <w:t xml:space="preserve"> et </w:t>
+      </w:r>
+      <w:proofErr w:type="spellStart"/>
+      <w:r>
+        <w:t>TextHelpers</w:t>
+      </w:r>
+      <w:proofErr w:type="spellEnd"/>
+      <w:r>
+        <w:t> : Ce sont des classes "utilitaires"</w:t>
+      </w:r>
+      <w:r>
+        <w:t xml:space="preserve">, </w:t>
+      </w:r>
+      <w:proofErr w:type="spellStart"/>
+      <w:r>
+        <w:t>GlobalHelpers</w:t>
+      </w:r>
+      <w:proofErr w:type="spellEnd"/>
+      <w:r>
+        <w:t xml:space="preserve"> donne un nombre aléatoire et </w:t>
+      </w:r>
+      <w:proofErr w:type="spellStart"/>
+      <w:r>
+        <w:t>TextHelpers</w:t>
+      </w:r>
+      <w:proofErr w:type="spellEnd"/>
+      <w:r>
+        <w:t xml:space="preserve"> aide à écrire sur l'écran.</w:t>
+      </w:r>
+      <w:r>
+        <w:t xml:space="preserve"> </w:t>
       </w:r>
     </w:p>
     <w:p>
       <w:pPr>
-        <w:pStyle w:val="Retraitcorpsdetexte"/>
-        <w:ind w:left="774"/>
+        <w:pStyle w:val="Paragraphedeliste"/>
       </w:pPr>
     </w:p>
     <w:p>
       <w:pPr>
-        <w:pStyle w:val="Retraitcorpsdetexte"/>
-        <w:numPr>
-          <w:ilvl w:val="0"/>
-          <w:numId w:val="53"/>
-        </w:numPr>
-        <w:ind w:left="360"/>
-      </w:pPr>
-      <w:r>
-        <w:t>« </w:t>
-      </w:r>
-      <w:proofErr w:type="spellStart"/>
-      <w:r>
-        <w:t>GlobalHelpers</w:t>
-      </w:r>
-      <w:proofErr w:type="spellEnd"/>
-      <w:r>
-        <w:t> » et « </w:t>
-      </w:r>
-      <w:proofErr w:type="spellStart"/>
-      <w:r>
-        <w:t>TextHelpers</w:t>
-      </w:r>
-      <w:proofErr w:type="spellEnd"/>
-      <w:r>
-        <w:t xml:space="preserve"> » : Ce sont des classes "utilitaires". Elles sont </w:t>
-      </w:r>
-      <w:proofErr w:type="spellStart"/>
-      <w:r>
-        <w:t>static</w:t>
-      </w:r>
-      <w:proofErr w:type="spellEnd"/>
-      <w:r>
-        <w:t xml:space="preserve"> parce qu'on n'a pas besoin de créer des objets. </w:t>
-      </w:r>
-      <w:proofErr w:type="spellStart"/>
-      <w:r>
-        <w:t>GlobalHelpers</w:t>
-      </w:r>
-      <w:proofErr w:type="spellEnd"/>
-      <w:r>
-        <w:t xml:space="preserve"> donne un nombre aléatoire et </w:t>
-      </w:r>
-      <w:proofErr w:type="spellStart"/>
-      <w:r>
-        <w:t>TextHelpers</w:t>
-      </w:r>
-      <w:proofErr w:type="spellEnd"/>
-      <w:r>
-        <w:t xml:space="preserve"> nous aide à écrire sur l'écran.</w:t>
-      </w:r>
-    </w:p>
-    <w:p>
-      <w:pPr>
-        <w:pStyle w:val="Paragraphedeliste"/>
-      </w:pPr>
-    </w:p>
-    <w:p>
-      <w:pPr>
         <w:pStyle w:val="Titre2"/>
       </w:pPr>
       <w:r>
-        <w:lastRenderedPageBreak/>
         <w:t>Utilisation IA</w:t>
       </w:r>
     </w:p>
@@ -4330,6 +4324,7 @@
         <w:pStyle w:val="Retraitcorpsdetexte"/>
       </w:pPr>
       <w:r>
+        <w:lastRenderedPageBreak/>
         <w:t xml:space="preserve">Pour apprendre à utiliser ces éléments j’ai demandé à </w:t>
       </w:r>
       <w:r>
@@ -6043,7 +6038,7 @@
         <v:path o:extrusionok="f" gradientshapeok="t" o:connecttype="rect"/>
         <o:lock v:ext="edit" aspectratio="t"/>
       </v:shapetype>
-      <v:shape id="_x0000_i1106" type="#_x0000_t75" style="width:11.25pt;height:11.25pt" o:bullet="t">
+      <v:shape id="_x0000_i1110" type="#_x0000_t75" style="width:11.25pt;height:11.25pt" o:bullet="t">
         <v:imagedata r:id="rId1" o:title="BD10263_"/>
       </v:shape>
     </w:pict>

</xml_diff>

<commit_message>
chore (rapport) : Fait la partie "utilisation de l'ia"
</commit_message>
<xml_diff>
--- a/doc/R-320-P_OO-KirilBormin.docx
+++ b/doc/R-320-P_OO-KirilBormin.docx
@@ -31,7 +31,7 @@
         <w:rPr>
           <w:lang w:val="en-US"/>
         </w:rPr>
-        <w:t>up !</w:t>
+        <w:t>up!</w:t>
       </w:r>
     </w:p>
     <w:p>
@@ -1869,13 +1869,80 @@
         <w:pStyle w:val="Retraitcorpsdetexte"/>
       </w:pPr>
       <w:r>
-        <w:t xml:space="preserve">Ce projet, réalisé dans le cadre du module P_OO , consiste à développer un jeu 2D de type "Shoot </w:t>
+        <w:t>Ce projet, réalisé dans le cadre du module P_</w:t>
+      </w:r>
+      <w:r>
+        <w:t>OO,</w:t>
+      </w:r>
+      <w:r>
+        <w:t xml:space="preserve"> consiste à développer un jeu 2D de type "Shoot </w:t>
       </w:r>
       <w:r>
         <w:t>me</w:t>
       </w:r>
       <w:r>
         <w:t xml:space="preserve"> up". L'objectif principal est de créer une application modulaire et fonctionnelle en C#, en respectant le cahier des charges. Le thème est une bataille aérienne où le joueur pilote un avion, doit détruire des ennemis et éviter des obstacles pour obtenir le meilleur score.</w:t>
+      </w:r>
+    </w:p>
+    <w:p>
+      <w:pPr>
+        <w:pStyle w:val="Titre2"/>
+      </w:pPr>
+      <w:r>
+        <w:t>Objectifs pédagogiques</w:t>
+      </w:r>
+    </w:p>
+    <w:p>
+      <w:pPr>
+        <w:pStyle w:val="Retraitcorpsdetexte"/>
+      </w:pPr>
+      <w:r>
+        <w:t xml:space="preserve">Les </w:t>
+      </w:r>
+      <w:r>
+        <w:t>objectifs</w:t>
+      </w:r>
+      <w:r>
+        <w:t xml:space="preserve"> pédagogiques dans </w:t>
+      </w:r>
+      <w:r>
+        <w:t xml:space="preserve">ce projet sont : </w:t>
+      </w:r>
+    </w:p>
+    <w:p>
+      <w:pPr>
+        <w:pStyle w:val="Retraitcorpsdetexte"/>
+        <w:numPr>
+          <w:ilvl w:val="0"/>
+          <w:numId w:val="55"/>
+        </w:numPr>
+      </w:pPr>
+      <w:r>
+        <w:t>Appliquer la Programmation Orientée Objet</w:t>
+      </w:r>
+    </w:p>
+    <w:p>
+      <w:pPr>
+        <w:pStyle w:val="Retraitcorpsdetexte"/>
+        <w:numPr>
+          <w:ilvl w:val="0"/>
+          <w:numId w:val="55"/>
+        </w:numPr>
+      </w:pPr>
+      <w:r>
+        <w:t>Apprendre à créer du code plus avancé</w:t>
+      </w:r>
+    </w:p>
+    <w:p>
+      <w:pPr>
+        <w:pStyle w:val="Retraitcorpsdetexte"/>
+        <w:numPr>
+          <w:ilvl w:val="0"/>
+          <w:numId w:val="55"/>
+        </w:numPr>
+      </w:pPr>
+      <w:r>
+        <w:t>Apprendre à utiliser un système de versionning (git)</w:t>
       </w:r>
     </w:p>
     <w:p>
@@ -2224,21 +2291,8 @@
               <w:t xml:space="preserve"> </w:t>
             </w:r>
             <w:r>
-              <w:t xml:space="preserve">des </w:t>
+              <w:t>des User’s Storys</w:t>
             </w:r>
-            <w:proofErr w:type="spellStart"/>
-            <w:r>
-              <w:t>User’s</w:t>
-            </w:r>
-            <w:proofErr w:type="spellEnd"/>
-            <w:r>
-              <w:t xml:space="preserve"> </w:t>
-            </w:r>
-            <w:proofErr w:type="spellStart"/>
-            <w:r>
-              <w:t>Storys</w:t>
-            </w:r>
-            <w:proofErr w:type="spellEnd"/>
           </w:p>
         </w:tc>
         <w:tc>
@@ -2428,8 +2482,13 @@
         <w:pStyle w:val="Retraitcorpsdetexte"/>
         <w:ind w:left="1068"/>
       </w:pPr>
-      <w:r>
-        <w:t xml:space="preserve">touches « WAD », </w:t>
+      <w:proofErr w:type="gramStart"/>
+      <w:r>
+        <w:t>touches</w:t>
+      </w:r>
+      <w:proofErr w:type="gramEnd"/>
+      <w:r>
+        <w:t xml:space="preserve"> « WAD », </w:t>
       </w:r>
       <w:r>
         <w:t>quand l’avion tourne dans une sens, il y pivote légèrement. Quand on relâche le bouton, l’avion</w:t>
@@ -3159,7 +3218,15 @@
       </w:r>
       <w:proofErr w:type="spellEnd"/>
       <w:r>
-        <w:t xml:space="preserve"> = 3 ).</w:t>
+        <w:t xml:space="preserve"> = </w:t>
+      </w:r>
+      <w:proofErr w:type="gramStart"/>
+      <w:r>
+        <w:t>3 )</w:t>
+      </w:r>
+      <w:proofErr w:type="gramEnd"/>
+      <w:r>
+        <w:t>.</w:t>
       </w:r>
     </w:p>
     <w:p>
@@ -3419,7 +3486,15 @@
       </w:r>
       <w:proofErr w:type="spellEnd"/>
       <w:r>
-        <w:t xml:space="preserve"> = 3 ) et peuvent être détruits par les missiles du joueur.</w:t>
+        <w:t xml:space="preserve"> = </w:t>
+      </w:r>
+      <w:proofErr w:type="gramStart"/>
+      <w:r>
+        <w:t>3 )</w:t>
+      </w:r>
+      <w:proofErr w:type="gramEnd"/>
+      <w:r>
+        <w:t xml:space="preserve"> et peuvent être détruits par les missiles du joueur.</w:t>
       </w:r>
     </w:p>
     <w:p>
@@ -4048,25 +4123,15 @@
         </w:numPr>
         <w:ind w:left="360"/>
       </w:pPr>
-      <w:proofErr w:type="spellStart"/>
-      <w:r>
-        <w:t>AirSpace</w:t>
-      </w:r>
-      <w:proofErr w:type="spellEnd"/>
-      <w:r>
-        <w:t xml:space="preserve"> : C'est la classe la plus importante</w:t>
+      <w:r>
+        <w:t>AirSpace : C'est la classe la plus importante</w:t>
       </w:r>
       <w:r>
         <w:t>, i</w:t>
       </w:r>
       <w:r>
-        <w:t xml:space="preserve">l hérite de </w:t>
-      </w:r>
-      <w:proofErr w:type="spellStart"/>
-      <w:r>
-        <w:t>Form</w:t>
-      </w:r>
-      <w:proofErr w:type="spellEnd"/>
+        <w:t>l hérite de Form</w:t>
+      </w:r>
       <w:r>
         <w:t xml:space="preserve">. </w:t>
       </w:r>
@@ -4077,15 +4142,7 @@
         <w:t xml:space="preserve"> </w:t>
       </w:r>
       <w:r>
-        <w:t xml:space="preserve">tourne en boucle et qui gère la logique principale, comme </w:t>
-      </w:r>
-      <w:proofErr w:type="spellStart"/>
-      <w:r>
-        <w:t>Render</w:t>
-      </w:r>
-      <w:proofErr w:type="spellEnd"/>
-      <w:r>
-        <w:t xml:space="preserve"> et Update de tous les objets.</w:t>
+        <w:t>tourne en boucle et qui gère la logique principale, comme Render et Update de tous les objets.</w:t>
       </w:r>
     </w:p>
     <w:p>
@@ -4097,21 +4154,8 @@
         </w:numPr>
         <w:ind w:left="360"/>
       </w:pPr>
-      <w:proofErr w:type="spellStart"/>
-      <w:r>
-        <w:t>AirSpace</w:t>
-      </w:r>
-      <w:proofErr w:type="spellEnd"/>
-      <w:r>
-        <w:t xml:space="preserve"> a des listes pour garder le Player, les </w:t>
-      </w:r>
-      <w:proofErr w:type="spellStart"/>
-      <w:r>
-        <w:t>Enemy</w:t>
-      </w:r>
-      <w:proofErr w:type="spellEnd"/>
-      <w:r>
-        <w:t xml:space="preserve">, les Missile et les Obstacle. Sur le diagramme, </w:t>
+      <w:r>
+        <w:t xml:space="preserve">AirSpace a des listes pour garder le Player, les Enemy, les Missile et les Obstacle. Sur le diagramme, </w:t>
       </w:r>
       <w:r>
         <w:t>ce sont</w:t>
@@ -4154,23 +4198,7 @@
         <w:ind w:left="360"/>
       </w:pPr>
       <w:r>
-        <w:t xml:space="preserve">Player, </w:t>
-      </w:r>
-      <w:proofErr w:type="spellStart"/>
-      <w:r>
-        <w:t>Enemy</w:t>
-      </w:r>
-      <w:proofErr w:type="spellEnd"/>
-      <w:r>
-        <w:t>, Missile, Obstacle : Ce sont les modèles pour les objets du jeu. Chaque classe a ses propres attributs comme _</w:t>
-      </w:r>
-      <w:proofErr w:type="spellStart"/>
-      <w:r>
-        <w:t>hp</w:t>
-      </w:r>
-      <w:proofErr w:type="spellEnd"/>
-      <w:r>
-        <w:t>, _x, _y,</w:t>
+        <w:t>Player, Enemy, Missile, Obstacle : Ce sont les modèles pour les objets du jeu. Chaque classe a ses propres attributs comme _hp, _x, _y,</w:t>
       </w:r>
       <w:r>
         <w:t xml:space="preserve"> _move, etc.</w:t>
@@ -4188,15 +4216,7 @@
         <w:t>leurs</w:t>
       </w:r>
       <w:r>
-        <w:t xml:space="preserve"> méthodes Update, </w:t>
-      </w:r>
-      <w:proofErr w:type="spellStart"/>
-      <w:r>
-        <w:t>Render</w:t>
-      </w:r>
-      <w:proofErr w:type="spellEnd"/>
-      <w:r>
-        <w:t>.</w:t>
+        <w:t xml:space="preserve"> méthodes Update, Render.</w:t>
       </w:r>
     </w:p>
     <w:p>
@@ -4212,15 +4232,7 @@
         <w:t>Program : Cette classe commence tout</w:t>
       </w:r>
       <w:r>
-        <w:t xml:space="preserve">, il appelle la classe </w:t>
-      </w:r>
-      <w:proofErr w:type="spellStart"/>
-      <w:r>
-        <w:t>AirSpace</w:t>
-      </w:r>
-      <w:proofErr w:type="spellEnd"/>
-      <w:r>
-        <w:t>, en lui donnant des paramètres pour les objets du jeu</w:t>
+        <w:t>, il appelle la classe AirSpace, en lui donnant des paramètres pour les objets du jeu</w:t>
       </w:r>
       <w:r>
         <w:t>.</w:t>
@@ -4235,40 +4247,14 @@
         </w:numPr>
         <w:ind w:left="360"/>
       </w:pPr>
-      <w:proofErr w:type="spellStart"/>
-      <w:r>
-        <w:t>GlobalHelpers</w:t>
-      </w:r>
-      <w:proofErr w:type="spellEnd"/>
-      <w:r>
-        <w:t xml:space="preserve"> et </w:t>
-      </w:r>
-      <w:proofErr w:type="spellStart"/>
-      <w:r>
-        <w:t>TextHelpers</w:t>
-      </w:r>
-      <w:proofErr w:type="spellEnd"/>
-      <w:r>
-        <w:t> : Ce sont des classes "utilitaires"</w:t>
+      <w:r>
+        <w:t>GlobalHelpers et TextHelpers : Ce sont des classes "utilitaires"</w:t>
       </w:r>
       <w:r>
         <w:t xml:space="preserve">, </w:t>
       </w:r>
-      <w:proofErr w:type="spellStart"/>
-      <w:r>
-        <w:t>GlobalHelpers</w:t>
-      </w:r>
-      <w:proofErr w:type="spellEnd"/>
-      <w:r>
-        <w:t xml:space="preserve"> donne un nombre aléatoire et </w:t>
-      </w:r>
-      <w:proofErr w:type="spellStart"/>
-      <w:r>
-        <w:t>TextHelpers</w:t>
-      </w:r>
-      <w:proofErr w:type="spellEnd"/>
-      <w:r>
-        <w:t xml:space="preserve"> aide à écrire sur l'écran.</w:t>
+      <w:r>
+        <w:t>GlobalHelpers donne un nombre aléatoire et TextHelpers aide à écrire sur l'écran.</w:t>
       </w:r>
       <w:r>
         <w:t xml:space="preserve"> </w:t>
@@ -6038,7 +6024,7 @@
         <v:path o:extrusionok="f" gradientshapeok="t" o:connecttype="rect"/>
         <o:lock v:ext="edit" aspectratio="t"/>
       </v:shapetype>
-      <v:shape id="_x0000_i1110" type="#_x0000_t75" style="width:11.25pt;height:11.25pt" o:bullet="t">
+      <v:shape id="_x0000_i1123" type="#_x0000_t75" style="width:11.25pt;height:11.25pt" o:bullet="t">
         <v:imagedata r:id="rId1" o:title="BD10263_"/>
       </v:shape>
     </w:pict>
@@ -7442,6 +7428,119 @@
     </w:lvl>
   </w:abstractNum>
   <w:abstractNum w:abstractNumId="21" w15:restartNumberingAfterBreak="0">
+    <w:nsid w:val="17177CA1"/>
+    <w:multiLevelType w:val="hybridMultilevel"/>
+    <w:tmpl w:val="F0C07D64"/>
+    <w:lvl w:ilvl="0" w:tplc="100C0001">
+      <w:start w:val="1"/>
+      <w:numFmt w:val="bullet"/>
+      <w:lvlText w:val=""/>
+      <w:lvlJc w:val="left"/>
+      <w:pPr>
+        <w:ind w:left="1854" w:hanging="360"/>
+      </w:pPr>
+      <w:rPr>
+        <w:rFonts w:ascii="Symbol" w:hAnsi="Symbol" w:hint="default"/>
+      </w:rPr>
+    </w:lvl>
+    <w:lvl w:ilvl="1" w:tplc="100C0003" w:tentative="1">
+      <w:start w:val="1"/>
+      <w:numFmt w:val="bullet"/>
+      <w:lvlText w:val="o"/>
+      <w:lvlJc w:val="left"/>
+      <w:pPr>
+        <w:ind w:left="2574" w:hanging="360"/>
+      </w:pPr>
+      <w:rPr>
+        <w:rFonts w:ascii="Courier New" w:hAnsi="Courier New" w:cs="Courier New" w:hint="default"/>
+      </w:rPr>
+    </w:lvl>
+    <w:lvl w:ilvl="2" w:tplc="100C0005" w:tentative="1">
+      <w:start w:val="1"/>
+      <w:numFmt w:val="bullet"/>
+      <w:lvlText w:val=""/>
+      <w:lvlJc w:val="left"/>
+      <w:pPr>
+        <w:ind w:left="3294" w:hanging="360"/>
+      </w:pPr>
+      <w:rPr>
+        <w:rFonts w:ascii="Wingdings" w:hAnsi="Wingdings" w:hint="default"/>
+      </w:rPr>
+    </w:lvl>
+    <w:lvl w:ilvl="3" w:tplc="100C0001" w:tentative="1">
+      <w:start w:val="1"/>
+      <w:numFmt w:val="bullet"/>
+      <w:lvlText w:val=""/>
+      <w:lvlJc w:val="left"/>
+      <w:pPr>
+        <w:ind w:left="4014" w:hanging="360"/>
+      </w:pPr>
+      <w:rPr>
+        <w:rFonts w:ascii="Symbol" w:hAnsi="Symbol" w:hint="default"/>
+      </w:rPr>
+    </w:lvl>
+    <w:lvl w:ilvl="4" w:tplc="100C0003" w:tentative="1">
+      <w:start w:val="1"/>
+      <w:numFmt w:val="bullet"/>
+      <w:lvlText w:val="o"/>
+      <w:lvlJc w:val="left"/>
+      <w:pPr>
+        <w:ind w:left="4734" w:hanging="360"/>
+      </w:pPr>
+      <w:rPr>
+        <w:rFonts w:ascii="Courier New" w:hAnsi="Courier New" w:cs="Courier New" w:hint="default"/>
+      </w:rPr>
+    </w:lvl>
+    <w:lvl w:ilvl="5" w:tplc="100C0005" w:tentative="1">
+      <w:start w:val="1"/>
+      <w:numFmt w:val="bullet"/>
+      <w:lvlText w:val=""/>
+      <w:lvlJc w:val="left"/>
+      <w:pPr>
+        <w:ind w:left="5454" w:hanging="360"/>
+      </w:pPr>
+      <w:rPr>
+        <w:rFonts w:ascii="Wingdings" w:hAnsi="Wingdings" w:hint="default"/>
+      </w:rPr>
+    </w:lvl>
+    <w:lvl w:ilvl="6" w:tplc="100C0001" w:tentative="1">
+      <w:start w:val="1"/>
+      <w:numFmt w:val="bullet"/>
+      <w:lvlText w:val=""/>
+      <w:lvlJc w:val="left"/>
+      <w:pPr>
+        <w:ind w:left="6174" w:hanging="360"/>
+      </w:pPr>
+      <w:rPr>
+        <w:rFonts w:ascii="Symbol" w:hAnsi="Symbol" w:hint="default"/>
+      </w:rPr>
+    </w:lvl>
+    <w:lvl w:ilvl="7" w:tplc="100C0003" w:tentative="1">
+      <w:start w:val="1"/>
+      <w:numFmt w:val="bullet"/>
+      <w:lvlText w:val="o"/>
+      <w:lvlJc w:val="left"/>
+      <w:pPr>
+        <w:ind w:left="6894" w:hanging="360"/>
+      </w:pPr>
+      <w:rPr>
+        <w:rFonts w:ascii="Courier New" w:hAnsi="Courier New" w:cs="Courier New" w:hint="default"/>
+      </w:rPr>
+    </w:lvl>
+    <w:lvl w:ilvl="8" w:tplc="100C0005" w:tentative="1">
+      <w:start w:val="1"/>
+      <w:numFmt w:val="bullet"/>
+      <w:lvlText w:val=""/>
+      <w:lvlJc w:val="left"/>
+      <w:pPr>
+        <w:ind w:left="7614" w:hanging="360"/>
+      </w:pPr>
+      <w:rPr>
+        <w:rFonts w:ascii="Wingdings" w:hAnsi="Wingdings" w:hint="default"/>
+      </w:rPr>
+    </w:lvl>
+  </w:abstractNum>
+  <w:abstractNum w:abstractNumId="22" w15:restartNumberingAfterBreak="0">
     <w:nsid w:val="173D29E6"/>
     <w:multiLevelType w:val="hybridMultilevel"/>
     <w:tmpl w:val="17D25458"/>
@@ -7554,7 +7653,7 @@
       </w:rPr>
     </w:lvl>
   </w:abstractNum>
-  <w:abstractNum w:abstractNumId="22" w15:restartNumberingAfterBreak="0">
+  <w:abstractNum w:abstractNumId="23" w15:restartNumberingAfterBreak="0">
     <w:nsid w:val="20CB35C8"/>
     <w:multiLevelType w:val="hybridMultilevel"/>
     <w:tmpl w:val="2AA2EA56"/>
@@ -7667,7 +7766,7 @@
       </w:rPr>
     </w:lvl>
   </w:abstractNum>
-  <w:abstractNum w:abstractNumId="23" w15:restartNumberingAfterBreak="0">
+  <w:abstractNum w:abstractNumId="24" w15:restartNumberingAfterBreak="0">
     <w:nsid w:val="2A8F67FD"/>
     <w:multiLevelType w:val="multilevel"/>
     <w:tmpl w:val="08EA5668"/>
@@ -7810,7 +7909,7 @@
       </w:rPr>
     </w:lvl>
   </w:abstractNum>
-  <w:abstractNum w:abstractNumId="24" w15:restartNumberingAfterBreak="0">
+  <w:abstractNum w:abstractNumId="25" w15:restartNumberingAfterBreak="0">
     <w:nsid w:val="2F2C5963"/>
     <w:multiLevelType w:val="multilevel"/>
     <w:tmpl w:val="E2569098"/>
@@ -7923,7 +8022,7 @@
       </w:pPr>
     </w:lvl>
   </w:abstractNum>
-  <w:abstractNum w:abstractNumId="25" w15:restartNumberingAfterBreak="0">
+  <w:abstractNum w:abstractNumId="26" w15:restartNumberingAfterBreak="0">
     <w:nsid w:val="36506853"/>
     <w:multiLevelType w:val="multilevel"/>
     <w:tmpl w:val="2F6EF210"/>
@@ -8036,7 +8135,7 @@
       </w:rPr>
     </w:lvl>
   </w:abstractNum>
-  <w:abstractNum w:abstractNumId="26" w15:restartNumberingAfterBreak="0">
+  <w:abstractNum w:abstractNumId="27" w15:restartNumberingAfterBreak="0">
     <w:nsid w:val="3BD16F36"/>
     <w:multiLevelType w:val="multilevel"/>
     <w:tmpl w:val="100C0021"/>
@@ -8149,7 +8248,7 @@
       </w:rPr>
     </w:lvl>
   </w:abstractNum>
-  <w:abstractNum w:abstractNumId="27" w15:restartNumberingAfterBreak="0">
+  <w:abstractNum w:abstractNumId="28" w15:restartNumberingAfterBreak="0">
     <w:nsid w:val="3C361DED"/>
     <w:multiLevelType w:val="multilevel"/>
     <w:tmpl w:val="100C0021"/>
@@ -8262,7 +8361,7 @@
       </w:rPr>
     </w:lvl>
   </w:abstractNum>
-  <w:abstractNum w:abstractNumId="28" w15:restartNumberingAfterBreak="0">
+  <w:abstractNum w:abstractNumId="29" w15:restartNumberingAfterBreak="0">
     <w:nsid w:val="3C8503A5"/>
     <w:multiLevelType w:val="hybridMultilevel"/>
     <w:tmpl w:val="48B01B5C"/>
@@ -8375,7 +8474,7 @@
       </w:rPr>
     </w:lvl>
   </w:abstractNum>
-  <w:abstractNum w:abstractNumId="29" w15:restartNumberingAfterBreak="0">
+  <w:abstractNum w:abstractNumId="30" w15:restartNumberingAfterBreak="0">
     <w:nsid w:val="3EF922F0"/>
     <w:multiLevelType w:val="multilevel"/>
     <w:tmpl w:val="100C0021"/>
@@ -8488,7 +8587,7 @@
       </w:rPr>
     </w:lvl>
   </w:abstractNum>
-  <w:abstractNum w:abstractNumId="30" w15:restartNumberingAfterBreak="0">
+  <w:abstractNum w:abstractNumId="31" w15:restartNumberingAfterBreak="0">
     <w:nsid w:val="405530E7"/>
     <w:multiLevelType w:val="hybridMultilevel"/>
     <w:tmpl w:val="BA98D9C4"/>
@@ -8601,7 +8700,7 @@
       </w:rPr>
     </w:lvl>
   </w:abstractNum>
-  <w:abstractNum w:abstractNumId="31" w15:restartNumberingAfterBreak="0">
+  <w:abstractNum w:abstractNumId="32" w15:restartNumberingAfterBreak="0">
     <w:nsid w:val="486164F4"/>
     <w:multiLevelType w:val="multilevel"/>
     <w:tmpl w:val="100C0021"/>
@@ -8714,7 +8813,7 @@
       </w:rPr>
     </w:lvl>
   </w:abstractNum>
-  <w:abstractNum w:abstractNumId="32" w15:restartNumberingAfterBreak="0">
+  <w:abstractNum w:abstractNumId="33" w15:restartNumberingAfterBreak="0">
     <w:nsid w:val="4C4E14AC"/>
     <w:multiLevelType w:val="multilevel"/>
     <w:tmpl w:val="100C001F"/>
@@ -8800,7 +8899,7 @@
       </w:pPr>
     </w:lvl>
   </w:abstractNum>
-  <w:abstractNum w:abstractNumId="33" w15:restartNumberingAfterBreak="0">
+  <w:abstractNum w:abstractNumId="34" w15:restartNumberingAfterBreak="0">
     <w:nsid w:val="4D30734E"/>
     <w:multiLevelType w:val="multilevel"/>
     <w:tmpl w:val="100C001D"/>
@@ -8886,7 +8985,7 @@
       </w:pPr>
     </w:lvl>
   </w:abstractNum>
-  <w:abstractNum w:abstractNumId="34" w15:restartNumberingAfterBreak="0">
+  <w:abstractNum w:abstractNumId="35" w15:restartNumberingAfterBreak="0">
     <w:nsid w:val="4E6713F6"/>
     <w:multiLevelType w:val="hybridMultilevel"/>
     <w:tmpl w:val="DC728DEE"/>
@@ -8999,7 +9098,7 @@
       </w:rPr>
     </w:lvl>
   </w:abstractNum>
-  <w:abstractNum w:abstractNumId="35" w15:restartNumberingAfterBreak="0">
+  <w:abstractNum w:abstractNumId="36" w15:restartNumberingAfterBreak="0">
     <w:nsid w:val="55FE2729"/>
     <w:multiLevelType w:val="multilevel"/>
     <w:tmpl w:val="100C0023"/>
@@ -9086,7 +9185,7 @@
       </w:pPr>
     </w:lvl>
   </w:abstractNum>
-  <w:abstractNum w:abstractNumId="36" w15:restartNumberingAfterBreak="0">
+  <w:abstractNum w:abstractNumId="37" w15:restartNumberingAfterBreak="0">
     <w:nsid w:val="58933B2A"/>
     <w:multiLevelType w:val="multilevel"/>
     <w:tmpl w:val="100C0021"/>
@@ -9199,7 +9298,7 @@
       </w:rPr>
     </w:lvl>
   </w:abstractNum>
-  <w:abstractNum w:abstractNumId="37" w15:restartNumberingAfterBreak="0">
+  <w:abstractNum w:abstractNumId="38" w15:restartNumberingAfterBreak="0">
     <w:nsid w:val="5C877673"/>
     <w:multiLevelType w:val="multilevel"/>
     <w:tmpl w:val="100C0021"/>
@@ -9312,7 +9411,7 @@
       </w:rPr>
     </w:lvl>
   </w:abstractNum>
-  <w:abstractNum w:abstractNumId="38" w15:restartNumberingAfterBreak="0">
+  <w:abstractNum w:abstractNumId="39" w15:restartNumberingAfterBreak="0">
     <w:nsid w:val="5CBC53EC"/>
     <w:multiLevelType w:val="multilevel"/>
     <w:tmpl w:val="2F6EF210"/>
@@ -9425,7 +9524,7 @@
       </w:rPr>
     </w:lvl>
   </w:abstractNum>
-  <w:abstractNum w:abstractNumId="39" w15:restartNumberingAfterBreak="0">
+  <w:abstractNum w:abstractNumId="40" w15:restartNumberingAfterBreak="0">
     <w:nsid w:val="5E424682"/>
     <w:multiLevelType w:val="multilevel"/>
     <w:tmpl w:val="100C001F"/>
@@ -9511,7 +9610,7 @@
       </w:pPr>
     </w:lvl>
   </w:abstractNum>
-  <w:abstractNum w:abstractNumId="40" w15:restartNumberingAfterBreak="0">
+  <w:abstractNum w:abstractNumId="41" w15:restartNumberingAfterBreak="0">
     <w:nsid w:val="63A9062F"/>
     <w:multiLevelType w:val="multilevel"/>
     <w:tmpl w:val="DCCE794A"/>
@@ -9651,7 +9750,7 @@
       </w:rPr>
     </w:lvl>
   </w:abstractNum>
-  <w:abstractNum w:abstractNumId="41" w15:restartNumberingAfterBreak="0">
+  <w:abstractNum w:abstractNumId="42" w15:restartNumberingAfterBreak="0">
     <w:nsid w:val="643F0961"/>
     <w:multiLevelType w:val="multilevel"/>
     <w:tmpl w:val="100C0021"/>
@@ -9764,7 +9863,7 @@
       </w:rPr>
     </w:lvl>
   </w:abstractNum>
-  <w:abstractNum w:abstractNumId="42" w15:restartNumberingAfterBreak="0">
+  <w:abstractNum w:abstractNumId="43" w15:restartNumberingAfterBreak="0">
     <w:nsid w:val="689854E7"/>
     <w:multiLevelType w:val="hybridMultilevel"/>
     <w:tmpl w:val="C4B28D26"/>
@@ -9877,7 +9976,7 @@
       </w:rPr>
     </w:lvl>
   </w:abstractNum>
-  <w:abstractNum w:abstractNumId="43" w15:restartNumberingAfterBreak="0">
+  <w:abstractNum w:abstractNumId="44" w15:restartNumberingAfterBreak="0">
     <w:nsid w:val="6D6476B9"/>
     <w:multiLevelType w:val="multilevel"/>
     <w:tmpl w:val="100C0023"/>
@@ -9964,7 +10063,7 @@
       </w:pPr>
     </w:lvl>
   </w:abstractNum>
-  <w:abstractNum w:abstractNumId="44" w15:restartNumberingAfterBreak="0">
+  <w:abstractNum w:abstractNumId="45" w15:restartNumberingAfterBreak="0">
     <w:nsid w:val="70C03573"/>
     <w:multiLevelType w:val="multilevel"/>
     <w:tmpl w:val="100C0021"/>
@@ -10077,7 +10176,7 @@
       </w:rPr>
     </w:lvl>
   </w:abstractNum>
-  <w:abstractNum w:abstractNumId="45" w15:restartNumberingAfterBreak="0">
+  <w:abstractNum w:abstractNumId="46" w15:restartNumberingAfterBreak="0">
     <w:nsid w:val="79CD09A9"/>
     <w:multiLevelType w:val="multilevel"/>
     <w:tmpl w:val="100C0021"/>
@@ -10190,7 +10289,7 @@
       </w:rPr>
     </w:lvl>
   </w:abstractNum>
-  <w:abstractNum w:abstractNumId="46" w15:restartNumberingAfterBreak="0">
+  <w:abstractNum w:abstractNumId="47" w15:restartNumberingAfterBreak="0">
     <w:nsid w:val="7E7F1C51"/>
     <w:multiLevelType w:val="multilevel"/>
     <w:tmpl w:val="100C0021"/>
@@ -10313,10 +10412,10 @@
     <w:abstractNumId w:val="16"/>
   </w:num>
   <w:num w:numId="4" w16cid:durableId="2071223764">
-    <w:abstractNumId w:val="40"/>
+    <w:abstractNumId w:val="41"/>
   </w:num>
   <w:num w:numId="5" w16cid:durableId="21563355">
-    <w:abstractNumId w:val="40"/>
+    <w:abstractNumId w:val="41"/>
   </w:num>
   <w:num w:numId="6" w16cid:durableId="289871386">
     <w:abstractNumId w:val="16"/>
@@ -10331,46 +10430,46 @@
     <w:abstractNumId w:val="16"/>
   </w:num>
   <w:num w:numId="10" w16cid:durableId="2038849588">
-    <w:abstractNumId w:val="40"/>
+    <w:abstractNumId w:val="41"/>
   </w:num>
   <w:num w:numId="11" w16cid:durableId="674114578">
     <w:abstractNumId w:val="16"/>
   </w:num>
   <w:num w:numId="12" w16cid:durableId="1349261024">
+    <w:abstractNumId w:val="25"/>
+  </w:num>
+  <w:num w:numId="13" w16cid:durableId="1200237235">
     <w:abstractNumId w:val="24"/>
   </w:num>
-  <w:num w:numId="13" w16cid:durableId="1200237235">
+  <w:num w:numId="14" w16cid:durableId="573200217">
     <w:abstractNumId w:val="23"/>
-  </w:num>
-  <w:num w:numId="14" w16cid:durableId="573200217">
-    <w:abstractNumId w:val="22"/>
   </w:num>
   <w:num w:numId="15" w16cid:durableId="798648019">
     <w:abstractNumId w:val="17"/>
   </w:num>
   <w:num w:numId="16" w16cid:durableId="2082632251">
-    <w:abstractNumId w:val="37"/>
+    <w:abstractNumId w:val="38"/>
   </w:num>
   <w:num w:numId="17" w16cid:durableId="2146894176">
-    <w:abstractNumId w:val="31"/>
+    <w:abstractNumId w:val="32"/>
   </w:num>
   <w:num w:numId="18" w16cid:durableId="1670476422">
-    <w:abstractNumId w:val="46"/>
+    <w:abstractNumId w:val="47"/>
   </w:num>
   <w:num w:numId="19" w16cid:durableId="1774085574">
-    <w:abstractNumId w:val="44"/>
+    <w:abstractNumId w:val="45"/>
   </w:num>
   <w:num w:numId="20" w16cid:durableId="1132482527">
     <w:abstractNumId w:val="10"/>
   </w:num>
   <w:num w:numId="21" w16cid:durableId="1928541929">
-    <w:abstractNumId w:val="41"/>
+    <w:abstractNumId w:val="42"/>
   </w:num>
   <w:num w:numId="22" w16cid:durableId="2057583399">
-    <w:abstractNumId w:val="29"/>
+    <w:abstractNumId w:val="30"/>
   </w:num>
   <w:num w:numId="23" w16cid:durableId="1955090194">
-    <w:abstractNumId w:val="26"/>
+    <w:abstractNumId w:val="27"/>
   </w:num>
   <w:num w:numId="24" w16cid:durableId="1708094444">
     <w:abstractNumId w:val="14"/>
@@ -10382,19 +10481,19 @@
     <w:abstractNumId w:val="12"/>
   </w:num>
   <w:num w:numId="27" w16cid:durableId="1419405076">
+    <w:abstractNumId w:val="37"/>
+  </w:num>
+  <w:num w:numId="28" w16cid:durableId="1834293107">
+    <w:abstractNumId w:val="40"/>
+  </w:num>
+  <w:num w:numId="29" w16cid:durableId="1106658217">
+    <w:abstractNumId w:val="34"/>
+  </w:num>
+  <w:num w:numId="30" w16cid:durableId="1913733430">
     <w:abstractNumId w:val="36"/>
   </w:num>
-  <w:num w:numId="28" w16cid:durableId="1834293107">
-    <w:abstractNumId w:val="39"/>
-  </w:num>
-  <w:num w:numId="29" w16cid:durableId="1106658217">
-    <w:abstractNumId w:val="33"/>
-  </w:num>
-  <w:num w:numId="30" w16cid:durableId="1913733430">
-    <w:abstractNumId w:val="35"/>
-  </w:num>
   <w:num w:numId="31" w16cid:durableId="683167554">
-    <w:abstractNumId w:val="43"/>
+    <w:abstractNumId w:val="44"/>
   </w:num>
   <w:num w:numId="32" w16cid:durableId="955259452">
     <w:abstractNumId w:val="8"/>
@@ -10427,43 +10526,46 @@
     <w:abstractNumId w:val="4"/>
   </w:num>
   <w:num w:numId="42" w16cid:durableId="556816648">
-    <w:abstractNumId w:val="32"/>
+    <w:abstractNumId w:val="33"/>
   </w:num>
   <w:num w:numId="43" w16cid:durableId="1242325609">
-    <w:abstractNumId w:val="27"/>
+    <w:abstractNumId w:val="28"/>
   </w:num>
   <w:num w:numId="44" w16cid:durableId="376517696">
-    <w:abstractNumId w:val="45"/>
+    <w:abstractNumId w:val="46"/>
   </w:num>
   <w:num w:numId="45" w16cid:durableId="534393247">
     <w:abstractNumId w:val="15"/>
   </w:num>
   <w:num w:numId="46" w16cid:durableId="1253321437">
-    <w:abstractNumId w:val="25"/>
+    <w:abstractNumId w:val="26"/>
   </w:num>
   <w:num w:numId="47" w16cid:durableId="1578444669">
-    <w:abstractNumId w:val="38"/>
+    <w:abstractNumId w:val="39"/>
   </w:num>
   <w:num w:numId="48" w16cid:durableId="1962347319">
-    <w:abstractNumId w:val="42"/>
+    <w:abstractNumId w:val="43"/>
   </w:num>
   <w:num w:numId="49" w16cid:durableId="1655065963">
-    <w:abstractNumId w:val="28"/>
+    <w:abstractNumId w:val="29"/>
   </w:num>
   <w:num w:numId="50" w16cid:durableId="1361473525">
-    <w:abstractNumId w:val="34"/>
+    <w:abstractNumId w:val="35"/>
   </w:num>
   <w:num w:numId="51" w16cid:durableId="1438528091">
     <w:abstractNumId w:val="13"/>
   </w:num>
   <w:num w:numId="52" w16cid:durableId="1790858702">
-    <w:abstractNumId w:val="21"/>
+    <w:abstractNumId w:val="22"/>
   </w:num>
   <w:num w:numId="53" w16cid:durableId="1364549896">
-    <w:abstractNumId w:val="30"/>
+    <w:abstractNumId w:val="31"/>
   </w:num>
   <w:num w:numId="54" w16cid:durableId="182400293">
     <w:abstractNumId w:val="20"/>
+  </w:num>
+  <w:num w:numId="55" w16cid:durableId="301272091">
+    <w:abstractNumId w:val="21"/>
   </w:num>
   <w:numIdMacAtCleanup w:val="4"/>
 </w:numbering>
@@ -11060,7 +11162,6 @@
   <w:style w:type="character" w:default="1" w:styleId="Policepardfaut">
     <w:name w:val="Default Paragraph Font"/>
     <w:uiPriority w:val="1"/>
-    <w:semiHidden/>
     <w:unhideWhenUsed/>
   </w:style>
   <w:style w:type="table" w:default="1" w:styleId="TableauNormal">

</xml_diff>